<commit_message>
satfeed convention in maxi partner
</commit_message>
<xml_diff>
--- a/BGIL_DBT/validation/travel/DM-A/DM-A1_OPUS.docx
+++ b/BGIL_DBT/validation/travel/DM-A/DM-A1_OPUS.docx
@@ -3203,9 +3203,6 @@
       <w:r>
         <w:t xml:space="preserve">1. OPUS — Type / length / scale comparison (all OPUS satellites)</w:t>
       </w:r>
-      <w:r>
-        <w:t xml:space="preserve">  [M1]</w:t>
-      </w:r>
     </w:p>
     <w:tbl>
       <w:tblPr>
@@ -4034,9 +4031,6 @@
       <w:r>
         <w:t xml:space="preserve">2. OPUS — SAT_COMMON_ADDRESS</w:t>
       </w:r>
-      <w:r>
-        <w:t xml:space="preserve">  [M1]</w:t>
-      </w:r>
     </w:p>
     <w:tbl>
       <w:tblPr>
@@ -4849,9 +4843,6 @@
       <w:r>
         <w:t xml:space="preserve">3. OPUS — SAT_COMMON_CLASSIFICATION</w:t>
       </w:r>
-      <w:r>
-        <w:t xml:space="preserve">  [M1]</w:t>
-      </w:r>
     </w:p>
     <w:tbl>
       <w:tblPr>
@@ -5376,9 +5367,6 @@
       <w:r>
         <w:t xml:space="preserve">4. OPUS — SAT_COMMON_CONTACT</w:t>
       </w:r>
-      <w:r>
-        <w:t xml:space="preserve">  [M1]</w:t>
-      </w:r>
     </w:p>
     <w:tbl>
       <w:tblPr>
@@ -6265,9 +6253,6 @@
       <w:r>
         <w:t xml:space="preserve">5. OPUS — SAT_COVERAGE_CONDITIONS</w:t>
       </w:r>
-      <w:r>
-        <w:t xml:space="preserve">  [M1]</w:t>
-      </w:r>
     </w:p>
     <w:tbl>
       <w:tblPr>
@@ -6702,9 +6687,6 @@
       <w:r>
         <w:t xml:space="preserve">6. OPUS — SAT_COVERAGE_DEFINITION</w:t>
       </w:r>
-      <w:r>
-        <w:t xml:space="preserve">  [M1]</w:t>
-      </w:r>
     </w:p>
     <w:tbl>
       <w:tblPr>
@@ -7575,9 +7557,6 @@
       <w:r>
         <w:t xml:space="preserve">7. OPUS — SAT_COVERAGE_LIMITS</w:t>
       </w:r>
-      <w:r>
-        <w:t xml:space="preserve">  [M1]</w:t>
-      </w:r>
     </w:p>
     <w:tbl>
       <w:tblPr>
@@ -8256,9 +8235,6 @@
       <w:r>
         <w:t xml:space="preserve">8. OPUS — SAT_FINTXN_COMMISSION</w:t>
       </w:r>
-      <w:r>
-        <w:t xml:space="preserve">  [M1]</w:t>
-      </w:r>
     </w:p>
     <w:tbl>
       <w:tblPr>
@@ -8823,9 +8799,6 @@
       <w:r>
         <w:t xml:space="preserve">9. OPUS — SAT_FINTXN_HEADER</w:t>
       </w:r>
-      <w:r>
-        <w:t xml:space="preserve">  [M1]</w:t>
-      </w:r>
     </w:p>
     <w:tbl>
       <w:tblPr>
@@ -9228,9 +9201,6 @@
       <w:r>
         <w:t xml:space="preserve">10. OPUS — SAT_FINTXN_PREMIUM</w:t>
       </w:r>
-      <w:r>
-        <w:t xml:space="preserve">  [M1]</w:t>
-      </w:r>
     </w:p>
     <w:tbl>
       <w:tblPr>
@@ -10261,9 +10231,6 @@
       <w:r>
         <w:t xml:space="preserve">11. OPUS — SAT_FINTXN_TAX</w:t>
       </w:r>
-      <w:r>
-        <w:t xml:space="preserve">  [M1]</w:t>
-      </w:r>
     </w:p>
     <w:tbl>
       <w:tblPr>
@@ -10844,9 +10811,6 @@
       <w:r>
         <w:t xml:space="preserve">12. OPUS — SAT_FIN_CHARGE_RATE</w:t>
       </w:r>
-      <w:r>
-        <w:t xml:space="preserve">  [M1]</w:t>
-      </w:r>
     </w:p>
     <w:tbl>
       <w:tblPr>
@@ -11427,9 +11391,6 @@
       <w:r>
         <w:t xml:space="preserve">13. OPUS — SAT_FIN_RECEIPT</w:t>
       </w:r>
-      <w:r>
-        <w:t xml:space="preserve">  [M1]</w:t>
-      </w:r>
     </w:p>
     <w:tbl>
       <w:tblPr>
@@ -12050,9 +12011,6 @@
       <w:r>
         <w:t xml:space="preserve">14. OPUS — SAT_LNK_ROLE_NOMINEE_BENEFICIARY</w:t>
       </w:r>
-      <w:r>
-        <w:t xml:space="preserve">  [M1]</w:t>
-      </w:r>
     </w:p>
     <w:tbl>
       <w:tblPr>
@@ -12577,9 +12535,6 @@
       <w:r>
         <w:t xml:space="preserve">15. OPUS — SAT_ORG_UNIT_DEFINITION</w:t>
       </w:r>
-      <w:r>
-        <w:t xml:space="preserve">  [M1]</w:t>
-      </w:r>
     </w:p>
     <w:tbl>
       <w:tblPr>
@@ -12982,9 +12937,6 @@
       <w:r>
         <w:t xml:space="preserve">16. OPUS — SAT_PARTY_EMPLOYMENT</w:t>
       </w:r>
-      <w:r>
-        <w:t xml:space="preserve">  [M1]</w:t>
-      </w:r>
     </w:p>
     <w:tbl>
       <w:tblPr>
@@ -13541,9 +13493,6 @@
       <w:r>
         <w:t xml:space="preserve">17. OPUS — SAT_PARTY_HEALTH_PROFILE</w:t>
       </w:r>
-      <w:r>
-        <w:t xml:space="preserve">  [M2]</w:t>
-      </w:r>
     </w:p>
     <w:tbl>
       <w:tblPr>
@@ -14068,9 +14017,6 @@
       <w:r>
         <w:t xml:space="preserve">18. OPUS — SAT_PARTY_IDENTIFICATION</w:t>
       </w:r>
-      <w:r>
-        <w:t xml:space="preserve">  [M2]</w:t>
-      </w:r>
     </w:p>
     <w:tbl>
       <w:tblPr>
@@ -14885,9 +14831,6 @@
       <w:r>
         <w:t xml:space="preserve">19. OPUS — SAT_PARTY_IDENTITY</w:t>
       </w:r>
-      <w:r>
-        <w:t xml:space="preserve">  [M2]</w:t>
-      </w:r>
     </w:p>
     <w:tbl>
       <w:tblPr>
@@ -15998,9 +15941,6 @@
       <w:r>
         <w:t xml:space="preserve">20. OPUS — SAT_PARTY_INDIVIDUAL_DEMOGRAPHICS</w:t>
       </w:r>
-      <w:r>
-        <w:t xml:space="preserve">  [M2]</w:t>
-      </w:r>
     </w:p>
     <w:tbl>
       <w:tblPr>
@@ -16525,9 +16465,6 @@
       <w:r>
         <w:t xml:space="preserve">21. OPUS — SAT_POLICY_CLASSIFICATION</w:t>
       </w:r>
-      <w:r>
-        <w:t xml:space="preserve">  [M2]</w:t>
-      </w:r>
     </w:p>
     <w:tbl>
       <w:tblPr>
@@ -17228,9 +17165,6 @@
       <w:r>
         <w:t xml:space="preserve">22. OPUS — SAT_POLICY_HEADER</w:t>
       </w:r>
-      <w:r>
-        <w:t xml:space="preserve">  [M2]</w:t>
-      </w:r>
     </w:p>
     <w:tbl>
       <w:tblPr>
@@ -18543,9 +18477,6 @@
       <w:r>
         <w:t xml:space="preserve">23. OPUS — SAT_POLICY_TERMS</w:t>
       </w:r>
-      <w:r>
-        <w:t xml:space="preserve">  [M2]</w:t>
-      </w:r>
     </w:p>
     <w:tbl>
       <w:tblPr>
@@ -19070,9 +19001,6 @@
       <w:r>
         <w:t xml:space="preserve">24. OPUS — SAT_PRODUCT_DEFINITION</w:t>
       </w:r>
-      <w:r>
-        <w:t xml:space="preserve">  [M2]</w:t>
-      </w:r>
     </w:p>
     <w:tbl>
       <w:tblPr>
@@ -19911,9 +19839,6 @@
       <w:r>
         <w:t xml:space="preserve">25. OPUS — SAT_PRODUCT_RATING_FACTOR</w:t>
       </w:r>
-      <w:r>
-        <w:t xml:space="preserve">  [M2]</w:t>
-      </w:r>
     </w:p>
     <w:tbl>
       <w:tblPr>
@@ -20400,9 +20325,6 @@
       <w:r>
         <w:t xml:space="preserve">26. OPUS — SAT_PRODUCT_RATING_STRUCTURE</w:t>
       </w:r>
-      <w:r>
-        <w:t xml:space="preserve">  [M2]</w:t>
-      </w:r>
     </w:p>
     <w:tbl>
       <w:tblPr>
@@ -20805,9 +20727,6 @@
       <w:r>
         <w:t xml:space="preserve">27. OPUS — SAT_PRODUCT_TERMS</w:t>
       </w:r>
-      <w:r>
-        <w:t xml:space="preserve">  [M2]</w:t>
-      </w:r>
     </w:p>
     <w:tbl>
       <w:tblPr>
@@ -21492,9 +21411,6 @@
       <w:r>
         <w:t xml:space="preserve">28. OPUS — SAT_PROPOSAL_UNDERWRITING</w:t>
       </w:r>
-      <w:r>
-        <w:t xml:space="preserve">  [M2]</w:t>
-      </w:r>
     </w:p>
     <w:tbl>
       <w:tblPr>
@@ -21929,9 +21845,6 @@
       <w:r>
         <w:t xml:space="preserve">29. OPUS — SAT_QUOTE_HEADER</w:t>
       </w:r>
-      <w:r>
-        <w:t xml:space="preserve">  [M2]</w:t>
-      </w:r>
     </w:p>
     <w:tbl>
       <w:tblPr>
@@ -22334,9 +22247,6 @@
       <w:r>
         <w:t xml:space="preserve">30. OPUS — SAT_RISK_MOTOR_DRIVER</w:t>
       </w:r>
-      <w:r>
-        <w:t xml:space="preserve">  [M2]</w:t>
-      </w:r>
     </w:p>
     <w:tbl>
       <w:tblPr>
@@ -22739,9 +22649,6 @@
       <w:r>
         <w:t xml:space="preserve">31. OPUS — SAT_RISK_MOTOR_VEHICLE</w:t>
       </w:r>
-      <w:r>
-        <w:t xml:space="preserve">  [M2]</w:t>
-      </w:r>
     </w:p>
     <w:tbl>
       <w:tblPr>
@@ -23400,9 +23307,6 @@
       <w:r>
         <w:t xml:space="preserve">32. OPUS — SAT_RISK_OBJECT_CORE</w:t>
       </w:r>
-      <w:r>
-        <w:t xml:space="preserve">  [M3]</w:t>
-      </w:r>
     </w:p>
     <w:tbl>
       <w:tblPr>
@@ -23805,9 +23709,6 @@
       <w:r>
         <w:t xml:space="preserve">33. OPUS — SAT_RISK_PERSON_INSURED</w:t>
       </w:r>
-      <w:r>
-        <w:t xml:space="preserve">  [M3]</w:t>
-      </w:r>
     </w:p>
     <w:tbl>
       <w:tblPr>
@@ -24378,9 +24279,6 @@
       <w:r>
         <w:t xml:space="preserve">34. OPUS — SAT_RISK_PERSON_TRAVEL</w:t>
       </w:r>
-      <w:r>
-        <w:t xml:space="preserve">  [M3]</w:t>
-      </w:r>
     </w:p>
     <w:tbl>
       <w:tblPr>
@@ -25185,9 +25083,6 @@
       <w:r>
         <w:t xml:space="preserve">35. OPUS — SAT_AUG_COMMON_COMMUNICATION_PREFERENCE</w:t>
       </w:r>
-      <w:r>
-        <w:t xml:space="preserve">  [M3]</w:t>
-      </w:r>
     </w:p>
     <w:tbl>
       <w:tblPr>
@@ -25590,9 +25485,6 @@
       <w:r>
         <w:t xml:space="preserve">36. OPUS — SAT_AUG_COVERAGE_DEFINITION</w:t>
       </w:r>
-      <w:r>
-        <w:t xml:space="preserve">  [M3]</w:t>
-      </w:r>
     </w:p>
     <w:tbl>
       <w:tblPr>
@@ -26041,9 +25933,6 @@
       <w:r>
         <w:t xml:space="preserve">37. OPUS — SAT_AUG_COVERAGE_LIMITS</w:t>
       </w:r>
-      <w:r>
-        <w:t xml:space="preserve">  [M3]</w:t>
-      </w:r>
     </w:p>
     <w:tbl>
       <w:tblPr>
@@ -26542,9 +26431,6 @@
       <w:r>
         <w:t xml:space="preserve">38. OPUS — SAT_AUG_COVERAGE_RATING</w:t>
       </w:r>
-      <w:r>
-        <w:t xml:space="preserve">  [M3]</w:t>
-      </w:r>
     </w:p>
     <w:tbl>
       <w:tblPr>
@@ -27219,9 +27105,6 @@
       <w:r>
         <w:t xml:space="preserve">39. OPUS — SAT_AUG_FINTXN_PREMIUM</w:t>
       </w:r>
-      <w:r>
-        <w:t xml:space="preserve">  [M3]</w:t>
-      </w:r>
     </w:p>
     <w:tbl>
       <w:tblPr>
@@ -27914,9 +27797,6 @@
       <w:r>
         <w:t xml:space="preserve">40. OPUS — SAT_AUG_LNK_PARTY_ROLE_CORE</w:t>
       </w:r>
-      <w:r>
-        <w:t xml:space="preserve">  [M3]</w:t>
-      </w:r>
     </w:p>
     <w:tbl>
       <w:tblPr>
@@ -28319,9 +28199,6 @@
       <w:r>
         <w:t xml:space="preserve">41. OPUS — SAT_AUG_LNK_ROLE_CUSTOMER</w:t>
       </w:r>
-      <w:r>
-        <w:t xml:space="preserve">  [M3]</w:t>
-      </w:r>
     </w:p>
     <w:tbl>
       <w:tblPr>
@@ -28846,9 +28723,6 @@
       <w:r>
         <w:t xml:space="preserve">42. OPUS — SAT_AUG_PARTY_BANKING</w:t>
       </w:r>
-      <w:r>
-        <w:t xml:space="preserve">  [M3]</w:t>
-      </w:r>
     </w:p>
     <w:tbl>
       <w:tblPr>
@@ -29251,9 +29125,6 @@
       <w:r>
         <w:t xml:space="preserve">43. OPUS — SAT_AUG_PARTY_EMPLOYMENT</w:t>
       </w:r>
-      <w:r>
-        <w:t xml:space="preserve">  [M3]</w:t>
-      </w:r>
     </w:p>
     <w:tbl>
       <w:tblPr>
@@ -29778,9 +29649,6 @@
       <w:r>
         <w:t xml:space="preserve">44. OPUS — SAT_AUG_PRODUCT_TERMS</w:t>
       </w:r>
-      <w:r>
-        <w:t xml:space="preserve">  [M3]</w:t>
-      </w:r>
     </w:p>
     <w:tbl>
       <w:tblPr>
@@ -30569,9 +30437,6 @@
       <w:r>
         <w:t xml:space="preserve">45. OPUS — SAT_AUG_RISK_PERSON_INSURED</w:t>
       </w:r>
-      <w:r>
-        <w:t xml:space="preserve">  [M3]</w:t>
-      </w:r>
     </w:p>
     <w:tbl>
       <w:tblPr>
@@ -31021,9 +30886,6 @@
       </w:pPr>
       <w:r>
         <w:t xml:space="preserve">46. OPUS — SAT_AUG_RISK_PERSON_TRAVEL</w:t>
-      </w:r>
-      <w:r>
-        <w:t xml:space="preserve">  [M3]</w:t>
       </w:r>
     </w:p>
     <w:tbl>

</xml_diff>

<commit_message>
updated docs travel recon
</commit_message>
<xml_diff>
--- a/BGIL_DBT/validation/travel/DM-A/DM-A1_OPUS.docx
+++ b/BGIL_DBT/validation/travel/DM-A/DM-A1_OPUS.docx
@@ -545,7 +545,7 @@
           </w:tcPr>
           <w:p>
             <w:r>
-              <w:t xml:space="preserve">Type / length / scale comparison (all OPUS satellites)</w:t>
+              <w:t xml:space="preserve">Type / length / scale comparison (all OPUS satellites)  [M1]</w:t>
             </w:r>
           </w:p>
         </w:tc>
@@ -603,7 +603,7 @@
           </w:tcPr>
           <w:p>
             <w:r>
-              <w:t xml:space="preserve">SAT_COMMON_ADDRESS</w:t>
+              <w:t xml:space="preserve">SAT_COMMON_ADDRESS  [M1]</w:t>
             </w:r>
           </w:p>
         </w:tc>
@@ -661,7 +661,7 @@
           </w:tcPr>
           <w:p>
             <w:r>
-              <w:t xml:space="preserve">SAT_COMMON_CLASSIFICATION</w:t>
+              <w:t xml:space="preserve">SAT_COMMON_CLASSIFICATION  [M1]</w:t>
             </w:r>
           </w:p>
         </w:tc>
@@ -719,7 +719,7 @@
           </w:tcPr>
           <w:p>
             <w:r>
-              <w:t xml:space="preserve">SAT_COMMON_CONTACT</w:t>
+              <w:t xml:space="preserve">SAT_COMMON_CONTACT  [M1]</w:t>
             </w:r>
           </w:p>
         </w:tc>
@@ -777,7 +777,7 @@
           </w:tcPr>
           <w:p>
             <w:r>
-              <w:t xml:space="preserve">SAT_COVERAGE_CONDITIONS</w:t>
+              <w:t xml:space="preserve">SAT_COVERAGE_CONDITIONS  [M1]</w:t>
             </w:r>
           </w:p>
         </w:tc>
@@ -835,7 +835,7 @@
           </w:tcPr>
           <w:p>
             <w:r>
-              <w:t xml:space="preserve">SAT_COVERAGE_DEFINITION</w:t>
+              <w:t xml:space="preserve">SAT_COVERAGE_DEFINITION  [M1]</w:t>
             </w:r>
           </w:p>
         </w:tc>
@@ -893,7 +893,7 @@
           </w:tcPr>
           <w:p>
             <w:r>
-              <w:t xml:space="preserve">SAT_COVERAGE_LIMITS</w:t>
+              <w:t xml:space="preserve">SAT_COVERAGE_LIMITS  [M1]</w:t>
             </w:r>
           </w:p>
         </w:tc>
@@ -951,7 +951,7 @@
           </w:tcPr>
           <w:p>
             <w:r>
-              <w:t xml:space="preserve">SAT_FINTXN_COMMISSION</w:t>
+              <w:t xml:space="preserve">SAT_FINTXN_COMMISSION  [M1]</w:t>
             </w:r>
           </w:p>
         </w:tc>
@@ -1009,7 +1009,7 @@
           </w:tcPr>
           <w:p>
             <w:r>
-              <w:t xml:space="preserve">SAT_FINTXN_HEADER</w:t>
+              <w:t xml:space="preserve">SAT_FINTXN_HEADER  [M1]</w:t>
             </w:r>
           </w:p>
         </w:tc>
@@ -1067,7 +1067,7 @@
           </w:tcPr>
           <w:p>
             <w:r>
-              <w:t xml:space="preserve">SAT_FINTXN_PREMIUM</w:t>
+              <w:t xml:space="preserve">SAT_FINTXN_PREMIUM  [M1]</w:t>
             </w:r>
           </w:p>
         </w:tc>
@@ -1125,7 +1125,7 @@
           </w:tcPr>
           <w:p>
             <w:r>
-              <w:t xml:space="preserve">SAT_FINTXN_TAX</w:t>
+              <w:t xml:space="preserve">SAT_FINTXN_TAX  [M1]</w:t>
             </w:r>
           </w:p>
         </w:tc>
@@ -1183,7 +1183,7 @@
           </w:tcPr>
           <w:p>
             <w:r>
-              <w:t xml:space="preserve">SAT_FIN_CHARGE_RATE</w:t>
+              <w:t xml:space="preserve">SAT_FIN_CHARGE_RATE  [M1]</w:t>
             </w:r>
           </w:p>
         </w:tc>
@@ -1241,7 +1241,7 @@
           </w:tcPr>
           <w:p>
             <w:r>
-              <w:t xml:space="preserve">SAT_FIN_RECEIPT</w:t>
+              <w:t xml:space="preserve">SAT_FIN_RECEIPT  [M1]</w:t>
             </w:r>
           </w:p>
         </w:tc>
@@ -1299,7 +1299,7 @@
           </w:tcPr>
           <w:p>
             <w:r>
-              <w:t xml:space="preserve">SAT_LNK_ROLE_NOMINEE_BENEFICIARY</w:t>
+              <w:t xml:space="preserve">SAT_LNK_ROLE_NOMINEE_BENEFICIARY  [M1]</w:t>
             </w:r>
           </w:p>
         </w:tc>
@@ -1357,7 +1357,7 @@
           </w:tcPr>
           <w:p>
             <w:r>
-              <w:t xml:space="preserve">SAT_ORG_UNIT_DEFINITION</w:t>
+              <w:t xml:space="preserve">SAT_ORG_UNIT_DEFINITION  [M1]</w:t>
             </w:r>
           </w:p>
         </w:tc>
@@ -1415,7 +1415,7 @@
           </w:tcPr>
           <w:p>
             <w:r>
-              <w:t xml:space="preserve">SAT_PARTY_EMPLOYMENT</w:t>
+              <w:t xml:space="preserve">SAT_PARTY_EMPLOYMENT  [M1]</w:t>
             </w:r>
           </w:p>
         </w:tc>
@@ -1473,7 +1473,7 @@
           </w:tcPr>
           <w:p>
             <w:r>
-              <w:t xml:space="preserve">SAT_PARTY_HEALTH_PROFILE</w:t>
+              <w:t xml:space="preserve">SAT_PARTY_HEALTH_PROFILE  [M2]</w:t>
             </w:r>
           </w:p>
         </w:tc>
@@ -1531,7 +1531,7 @@
           </w:tcPr>
           <w:p>
             <w:r>
-              <w:t xml:space="preserve">SAT_PARTY_IDENTIFICATION</w:t>
+              <w:t xml:space="preserve">SAT_PARTY_IDENTIFICATION  [M2]</w:t>
             </w:r>
           </w:p>
         </w:tc>
@@ -1589,7 +1589,7 @@
           </w:tcPr>
           <w:p>
             <w:r>
-              <w:t xml:space="preserve">SAT_PARTY_IDENTITY</w:t>
+              <w:t xml:space="preserve">SAT_PARTY_IDENTITY  [M2]</w:t>
             </w:r>
           </w:p>
         </w:tc>
@@ -1647,7 +1647,7 @@
           </w:tcPr>
           <w:p>
             <w:r>
-              <w:t xml:space="preserve">SAT_PARTY_INDIVIDUAL_DEMOGRAPHICS</w:t>
+              <w:t xml:space="preserve">SAT_PARTY_INDIVIDUAL_DEMOGRAPHICS  [M2]</w:t>
             </w:r>
           </w:p>
         </w:tc>
@@ -1705,7 +1705,7 @@
           </w:tcPr>
           <w:p>
             <w:r>
-              <w:t xml:space="preserve">SAT_POLICY_CLASSIFICATION</w:t>
+              <w:t xml:space="preserve">SAT_POLICY_CLASSIFICATION  [M2]</w:t>
             </w:r>
           </w:p>
         </w:tc>
@@ -1763,7 +1763,7 @@
           </w:tcPr>
           <w:p>
             <w:r>
-              <w:t xml:space="preserve">SAT_POLICY_HEADER</w:t>
+              <w:t xml:space="preserve">SAT_POLICY_HEADER  [M2]</w:t>
             </w:r>
           </w:p>
         </w:tc>
@@ -1821,7 +1821,7 @@
           </w:tcPr>
           <w:p>
             <w:r>
-              <w:t xml:space="preserve">SAT_POLICY_TERMS</w:t>
+              <w:t xml:space="preserve">SAT_POLICY_TERMS  [M2]</w:t>
             </w:r>
           </w:p>
         </w:tc>
@@ -1879,7 +1879,7 @@
           </w:tcPr>
           <w:p>
             <w:r>
-              <w:t xml:space="preserve">SAT_PRODUCT_DEFINITION</w:t>
+              <w:t xml:space="preserve">SAT_PRODUCT_DEFINITION  [M2]</w:t>
             </w:r>
           </w:p>
         </w:tc>
@@ -1937,7 +1937,7 @@
           </w:tcPr>
           <w:p>
             <w:r>
-              <w:t xml:space="preserve">SAT_PRODUCT_RATING_FACTOR</w:t>
+              <w:t xml:space="preserve">SAT_PRODUCT_RATING_FACTOR  [M2]</w:t>
             </w:r>
           </w:p>
         </w:tc>
@@ -1995,7 +1995,7 @@
           </w:tcPr>
           <w:p>
             <w:r>
-              <w:t xml:space="preserve">SAT_PRODUCT_RATING_STRUCTURE</w:t>
+              <w:t xml:space="preserve">SAT_PRODUCT_RATING_STRUCTURE  [M2]</w:t>
             </w:r>
           </w:p>
         </w:tc>
@@ -2053,7 +2053,7 @@
           </w:tcPr>
           <w:p>
             <w:r>
-              <w:t xml:space="preserve">SAT_PRODUCT_TERMS</w:t>
+              <w:t xml:space="preserve">SAT_PRODUCT_TERMS  [M2]</w:t>
             </w:r>
           </w:p>
         </w:tc>
@@ -2111,7 +2111,7 @@
           </w:tcPr>
           <w:p>
             <w:r>
-              <w:t xml:space="preserve">SAT_PROPOSAL_UNDERWRITING</w:t>
+              <w:t xml:space="preserve">SAT_PROPOSAL_UNDERWRITING  [M2]</w:t>
             </w:r>
           </w:p>
         </w:tc>
@@ -2169,7 +2169,7 @@
           </w:tcPr>
           <w:p>
             <w:r>
-              <w:t xml:space="preserve">SAT_QUOTE_HEADER</w:t>
+              <w:t xml:space="preserve">SAT_QUOTE_HEADER  [M2]</w:t>
             </w:r>
           </w:p>
         </w:tc>
@@ -2227,7 +2227,7 @@
           </w:tcPr>
           <w:p>
             <w:r>
-              <w:t xml:space="preserve">SAT_RISK_MOTOR_DRIVER</w:t>
+              <w:t xml:space="preserve">SAT_RISK_MOTOR_DRIVER  [M2]</w:t>
             </w:r>
           </w:p>
         </w:tc>
@@ -2285,7 +2285,7 @@
           </w:tcPr>
           <w:p>
             <w:r>
-              <w:t xml:space="preserve">SAT_RISK_MOTOR_VEHICLE</w:t>
+              <w:t xml:space="preserve">SAT_RISK_MOTOR_VEHICLE  [M2]</w:t>
             </w:r>
           </w:p>
         </w:tc>
@@ -2343,7 +2343,7 @@
           </w:tcPr>
           <w:p>
             <w:r>
-              <w:t xml:space="preserve">SAT_RISK_OBJECT_CORE</w:t>
+              <w:t xml:space="preserve">SAT_RISK_OBJECT_CORE  [M3]</w:t>
             </w:r>
           </w:p>
         </w:tc>
@@ -2401,7 +2401,7 @@
           </w:tcPr>
           <w:p>
             <w:r>
-              <w:t xml:space="preserve">SAT_RISK_PERSON_INSURED</w:t>
+              <w:t xml:space="preserve">SAT_RISK_PERSON_INSURED  [M3]</w:t>
             </w:r>
           </w:p>
         </w:tc>
@@ -2459,7 +2459,7 @@
           </w:tcPr>
           <w:p>
             <w:r>
-              <w:t xml:space="preserve">SAT_RISK_PERSON_TRAVEL</w:t>
+              <w:t xml:space="preserve">SAT_RISK_PERSON_TRAVEL  [M3]</w:t>
             </w:r>
           </w:p>
         </w:tc>
@@ -2517,7 +2517,7 @@
           </w:tcPr>
           <w:p>
             <w:r>
-              <w:t xml:space="preserve">SAT_AUG_COMMON_COMMUNICATION_PREFERENCE</w:t>
+              <w:t xml:space="preserve">SAT_AUG_COMMON_COMMUNICATION_PREFERENCE  [M3]</w:t>
             </w:r>
           </w:p>
         </w:tc>
@@ -2575,7 +2575,7 @@
           </w:tcPr>
           <w:p>
             <w:r>
-              <w:t xml:space="preserve">SAT_AUG_COVERAGE_DEFINITION</w:t>
+              <w:t xml:space="preserve">SAT_AUG_COVERAGE_DEFINITION  [M3]</w:t>
             </w:r>
           </w:p>
         </w:tc>
@@ -2633,7 +2633,7 @@
           </w:tcPr>
           <w:p>
             <w:r>
-              <w:t xml:space="preserve">SAT_AUG_COVERAGE_LIMITS</w:t>
+              <w:t xml:space="preserve">SAT_AUG_COVERAGE_LIMITS  [M3]</w:t>
             </w:r>
           </w:p>
         </w:tc>
@@ -2691,7 +2691,7 @@
           </w:tcPr>
           <w:p>
             <w:r>
-              <w:t xml:space="preserve">SAT_AUG_COVERAGE_RATING</w:t>
+              <w:t xml:space="preserve">SAT_AUG_COVERAGE_RATING  [M3]</w:t>
             </w:r>
           </w:p>
         </w:tc>
@@ -2749,7 +2749,7 @@
           </w:tcPr>
           <w:p>
             <w:r>
-              <w:t xml:space="preserve">SAT_AUG_FINTXN_PREMIUM</w:t>
+              <w:t xml:space="preserve">SAT_AUG_FINTXN_PREMIUM  [M3]</w:t>
             </w:r>
           </w:p>
         </w:tc>
@@ -2807,7 +2807,7 @@
           </w:tcPr>
           <w:p>
             <w:r>
-              <w:t xml:space="preserve">SAT_AUG_LNK_PARTY_ROLE_CORE</w:t>
+              <w:t xml:space="preserve">SAT_AUG_LNK_PARTY_ROLE_CORE  [M3]</w:t>
             </w:r>
           </w:p>
         </w:tc>
@@ -2865,7 +2865,7 @@
           </w:tcPr>
           <w:p>
             <w:r>
-              <w:t xml:space="preserve">SAT_AUG_LNK_ROLE_CUSTOMER</w:t>
+              <w:t xml:space="preserve">SAT_AUG_LNK_ROLE_CUSTOMER  [M3]</w:t>
             </w:r>
           </w:p>
         </w:tc>
@@ -2923,7 +2923,7 @@
           </w:tcPr>
           <w:p>
             <w:r>
-              <w:t xml:space="preserve">SAT_AUG_PARTY_BANKING</w:t>
+              <w:t xml:space="preserve">SAT_AUG_PARTY_BANKING  [M3]</w:t>
             </w:r>
           </w:p>
         </w:tc>
@@ -2981,7 +2981,7 @@
           </w:tcPr>
           <w:p>
             <w:r>
-              <w:t xml:space="preserve">SAT_AUG_PARTY_EMPLOYMENT</w:t>
+              <w:t xml:space="preserve">SAT_AUG_PARTY_EMPLOYMENT  [M3]</w:t>
             </w:r>
           </w:p>
         </w:tc>
@@ -3039,7 +3039,7 @@
           </w:tcPr>
           <w:p>
             <w:r>
-              <w:t xml:space="preserve">SAT_AUG_PRODUCT_TERMS</w:t>
+              <w:t xml:space="preserve">SAT_AUG_PRODUCT_TERMS  [M3]</w:t>
             </w:r>
           </w:p>
         </w:tc>
@@ -3097,7 +3097,7 @@
           </w:tcPr>
           <w:p>
             <w:r>
-              <w:t xml:space="preserve">SAT_AUG_RISK_PERSON_INSURED</w:t>
+              <w:t xml:space="preserve">SAT_AUG_RISK_PERSON_INSURED  [M3]</w:t>
             </w:r>
           </w:p>
         </w:tc>
@@ -3155,7 +3155,7 @@
           </w:tcPr>
           <w:p>
             <w:r>
-              <w:t xml:space="preserve">SAT_AUG_RISK_PERSON_TRAVEL</w:t>
+              <w:t xml:space="preserve">SAT_AUG_RISK_PERSON_TRAVEL  [M3]</w:t>
             </w:r>
           </w:p>
         </w:tc>
@@ -3202,6 +3202,12 @@
       </w:pPr>
       <w:r>
         <w:t xml:space="preserve">1. OPUS — Type / length / scale comparison (all OPUS satellites)</w:t>
+      </w:r>
+      <w:r>
+        <w:t xml:space="preserve">  [M1]</w:t>
+      </w:r>
+      <w:r>
+        <w:t xml:space="preserve">  [M1]</w:t>
       </w:r>
     </w:p>
     <w:tbl>
@@ -4031,6 +4037,12 @@
       <w:r>
         <w:t xml:space="preserve">2. OPUS — SAT_COMMON_ADDRESS</w:t>
       </w:r>
+      <w:r>
+        <w:t xml:space="preserve">  [M1]</w:t>
+      </w:r>
+      <w:r>
+        <w:t xml:space="preserve">  [M1]</w:t>
+      </w:r>
     </w:p>
     <w:tbl>
       <w:tblPr>
@@ -4843,6 +4855,12 @@
       <w:r>
         <w:t xml:space="preserve">3. OPUS — SAT_COMMON_CLASSIFICATION</w:t>
       </w:r>
+      <w:r>
+        <w:t xml:space="preserve">  [M1]</w:t>
+      </w:r>
+      <w:r>
+        <w:t xml:space="preserve">  [M1]</w:t>
+      </w:r>
     </w:p>
     <w:tbl>
       <w:tblPr>
@@ -5367,6 +5385,12 @@
       <w:r>
         <w:t xml:space="preserve">4. OPUS — SAT_COMMON_CONTACT</w:t>
       </w:r>
+      <w:r>
+        <w:t xml:space="preserve">  [M1]</w:t>
+      </w:r>
+      <w:r>
+        <w:t xml:space="preserve">  [M1]</w:t>
+      </w:r>
     </w:p>
     <w:tbl>
       <w:tblPr>
@@ -6253,6 +6277,12 @@
       <w:r>
         <w:t xml:space="preserve">5. OPUS — SAT_COVERAGE_CONDITIONS</w:t>
       </w:r>
+      <w:r>
+        <w:t xml:space="preserve">  [M1]</w:t>
+      </w:r>
+      <w:r>
+        <w:t xml:space="preserve">  [M1]</w:t>
+      </w:r>
     </w:p>
     <w:tbl>
       <w:tblPr>
@@ -6687,6 +6717,12 @@
       <w:r>
         <w:t xml:space="preserve">6. OPUS — SAT_COVERAGE_DEFINITION</w:t>
       </w:r>
+      <w:r>
+        <w:t xml:space="preserve">  [M1]</w:t>
+      </w:r>
+      <w:r>
+        <w:t xml:space="preserve">  [M1]</w:t>
+      </w:r>
     </w:p>
     <w:tbl>
       <w:tblPr>
@@ -7557,6 +7593,12 @@
       <w:r>
         <w:t xml:space="preserve">7. OPUS — SAT_COVERAGE_LIMITS</w:t>
       </w:r>
+      <w:r>
+        <w:t xml:space="preserve">  [M1]</w:t>
+      </w:r>
+      <w:r>
+        <w:t xml:space="preserve">  [M1]</w:t>
+      </w:r>
     </w:p>
     <w:tbl>
       <w:tblPr>
@@ -8235,6 +8277,12 @@
       <w:r>
         <w:t xml:space="preserve">8. OPUS — SAT_FINTXN_COMMISSION</w:t>
       </w:r>
+      <w:r>
+        <w:t xml:space="preserve">  [M1]</w:t>
+      </w:r>
+      <w:r>
+        <w:t xml:space="preserve">  [M1]</w:t>
+      </w:r>
     </w:p>
     <w:tbl>
       <w:tblPr>
@@ -8799,6 +8847,12 @@
       <w:r>
         <w:t xml:space="preserve">9. OPUS — SAT_FINTXN_HEADER</w:t>
       </w:r>
+      <w:r>
+        <w:t xml:space="preserve">  [M1]</w:t>
+      </w:r>
+      <w:r>
+        <w:t xml:space="preserve">  [M1]</w:t>
+      </w:r>
     </w:p>
     <w:tbl>
       <w:tblPr>
@@ -9201,6 +9255,12 @@
       <w:r>
         <w:t xml:space="preserve">10. OPUS — SAT_FINTXN_PREMIUM</w:t>
       </w:r>
+      <w:r>
+        <w:t xml:space="preserve">  [M1]</w:t>
+      </w:r>
+      <w:r>
+        <w:t xml:space="preserve">  [M1]</w:t>
+      </w:r>
     </w:p>
     <w:tbl>
       <w:tblPr>
@@ -10231,6 +10291,12 @@
       <w:r>
         <w:t xml:space="preserve">11. OPUS — SAT_FINTXN_TAX</w:t>
       </w:r>
+      <w:r>
+        <w:t xml:space="preserve">  [M1]</w:t>
+      </w:r>
+      <w:r>
+        <w:t xml:space="preserve">  [M1]</w:t>
+      </w:r>
     </w:p>
     <w:tbl>
       <w:tblPr>
@@ -10811,6 +10877,12 @@
       <w:r>
         <w:t xml:space="preserve">12. OPUS — SAT_FIN_CHARGE_RATE</w:t>
       </w:r>
+      <w:r>
+        <w:t xml:space="preserve">  [M1]</w:t>
+      </w:r>
+      <w:r>
+        <w:t xml:space="preserve">  [M1]</w:t>
+      </w:r>
     </w:p>
     <w:tbl>
       <w:tblPr>
@@ -11391,6 +11463,12 @@
       <w:r>
         <w:t xml:space="preserve">13. OPUS — SAT_FIN_RECEIPT</w:t>
       </w:r>
+      <w:r>
+        <w:t xml:space="preserve">  [M1]</w:t>
+      </w:r>
+      <w:r>
+        <w:t xml:space="preserve">  [M1]</w:t>
+      </w:r>
     </w:p>
     <w:tbl>
       <w:tblPr>
@@ -12011,6 +12089,12 @@
       <w:r>
         <w:t xml:space="preserve">14. OPUS — SAT_LNK_ROLE_NOMINEE_BENEFICIARY</w:t>
       </w:r>
+      <w:r>
+        <w:t xml:space="preserve">  [M1]</w:t>
+      </w:r>
+      <w:r>
+        <w:t xml:space="preserve">  [M1]</w:t>
+      </w:r>
     </w:p>
     <w:tbl>
       <w:tblPr>
@@ -12535,6 +12619,12 @@
       <w:r>
         <w:t xml:space="preserve">15. OPUS — SAT_ORG_UNIT_DEFINITION</w:t>
       </w:r>
+      <w:r>
+        <w:t xml:space="preserve">  [M1]</w:t>
+      </w:r>
+      <w:r>
+        <w:t xml:space="preserve">  [M1]</w:t>
+      </w:r>
     </w:p>
     <w:tbl>
       <w:tblPr>
@@ -12937,6 +13027,12 @@
       <w:r>
         <w:t xml:space="preserve">16. OPUS — SAT_PARTY_EMPLOYMENT</w:t>
       </w:r>
+      <w:r>
+        <w:t xml:space="preserve">  [M1]</w:t>
+      </w:r>
+      <w:r>
+        <w:t xml:space="preserve">  [M1]</w:t>
+      </w:r>
     </w:p>
     <w:tbl>
       <w:tblPr>
@@ -13493,6 +13589,12 @@
       <w:r>
         <w:t xml:space="preserve">17. OPUS — SAT_PARTY_HEALTH_PROFILE</w:t>
       </w:r>
+      <w:r>
+        <w:t xml:space="preserve">  [M2]</w:t>
+      </w:r>
+      <w:r>
+        <w:t xml:space="preserve">  [M2]</w:t>
+      </w:r>
     </w:p>
     <w:tbl>
       <w:tblPr>
@@ -14017,6 +14119,12 @@
       <w:r>
         <w:t xml:space="preserve">18. OPUS — SAT_PARTY_IDENTIFICATION</w:t>
       </w:r>
+      <w:r>
+        <w:t xml:space="preserve">  [M2]</w:t>
+      </w:r>
+      <w:r>
+        <w:t xml:space="preserve">  [M2]</w:t>
+      </w:r>
     </w:p>
     <w:tbl>
       <w:tblPr>
@@ -14831,6 +14939,12 @@
       <w:r>
         <w:t xml:space="preserve">19. OPUS — SAT_PARTY_IDENTITY</w:t>
       </w:r>
+      <w:r>
+        <w:t xml:space="preserve">  [M2]</w:t>
+      </w:r>
+      <w:r>
+        <w:t xml:space="preserve">  [M2]</w:t>
+      </w:r>
     </w:p>
     <w:tbl>
       <w:tblPr>
@@ -15941,6 +16055,12 @@
       <w:r>
         <w:t xml:space="preserve">20. OPUS — SAT_PARTY_INDIVIDUAL_DEMOGRAPHICS</w:t>
       </w:r>
+      <w:r>
+        <w:t xml:space="preserve">  [M2]</w:t>
+      </w:r>
+      <w:r>
+        <w:t xml:space="preserve">  [M2]</w:t>
+      </w:r>
     </w:p>
     <w:tbl>
       <w:tblPr>
@@ -16465,6 +16585,12 @@
       <w:r>
         <w:t xml:space="preserve">21. OPUS — SAT_POLICY_CLASSIFICATION</w:t>
       </w:r>
+      <w:r>
+        <w:t xml:space="preserve">  [M2]</w:t>
+      </w:r>
+      <w:r>
+        <w:t xml:space="preserve">  [M2]</w:t>
+      </w:r>
     </w:p>
     <w:tbl>
       <w:tblPr>
@@ -17165,6 +17291,12 @@
       <w:r>
         <w:t xml:space="preserve">22. OPUS — SAT_POLICY_HEADER</w:t>
       </w:r>
+      <w:r>
+        <w:t xml:space="preserve">  [M2]</w:t>
+      </w:r>
+      <w:r>
+        <w:t xml:space="preserve">  [M2]</w:t>
+      </w:r>
     </w:p>
     <w:tbl>
       <w:tblPr>
@@ -18477,6 +18609,12 @@
       <w:r>
         <w:t xml:space="preserve">23. OPUS — SAT_POLICY_TERMS</w:t>
       </w:r>
+      <w:r>
+        <w:t xml:space="preserve">  [M2]</w:t>
+      </w:r>
+      <w:r>
+        <w:t xml:space="preserve">  [M2]</w:t>
+      </w:r>
     </w:p>
     <w:tbl>
       <w:tblPr>
@@ -19001,6 +19139,12 @@
       <w:r>
         <w:t xml:space="preserve">24. OPUS — SAT_PRODUCT_DEFINITION</w:t>
       </w:r>
+      <w:r>
+        <w:t xml:space="preserve">  [M2]</w:t>
+      </w:r>
+      <w:r>
+        <w:t xml:space="preserve">  [M2]</w:t>
+      </w:r>
     </w:p>
     <w:tbl>
       <w:tblPr>
@@ -19839,6 +19983,12 @@
       <w:r>
         <w:t xml:space="preserve">25. OPUS — SAT_PRODUCT_RATING_FACTOR</w:t>
       </w:r>
+      <w:r>
+        <w:t xml:space="preserve">  [M2]</w:t>
+      </w:r>
+      <w:r>
+        <w:t xml:space="preserve">  [M2]</w:t>
+      </w:r>
     </w:p>
     <w:tbl>
       <w:tblPr>
@@ -20325,6 +20475,12 @@
       <w:r>
         <w:t xml:space="preserve">26. OPUS — SAT_PRODUCT_RATING_STRUCTURE</w:t>
       </w:r>
+      <w:r>
+        <w:t xml:space="preserve">  [M2]</w:t>
+      </w:r>
+      <w:r>
+        <w:t xml:space="preserve">  [M2]</w:t>
+      </w:r>
     </w:p>
     <w:tbl>
       <w:tblPr>
@@ -20727,6 +20883,12 @@
       <w:r>
         <w:t xml:space="preserve">27. OPUS — SAT_PRODUCT_TERMS</w:t>
       </w:r>
+      <w:r>
+        <w:t xml:space="preserve">  [M2]</w:t>
+      </w:r>
+      <w:r>
+        <w:t xml:space="preserve">  [M2]</w:t>
+      </w:r>
     </w:p>
     <w:tbl>
       <w:tblPr>
@@ -21411,6 +21573,12 @@
       <w:r>
         <w:t xml:space="preserve">28. OPUS — SAT_PROPOSAL_UNDERWRITING</w:t>
       </w:r>
+      <w:r>
+        <w:t xml:space="preserve">  [M2]</w:t>
+      </w:r>
+      <w:r>
+        <w:t xml:space="preserve">  [M2]</w:t>
+      </w:r>
     </w:p>
     <w:tbl>
       <w:tblPr>
@@ -21845,6 +22013,12 @@
       <w:r>
         <w:t xml:space="preserve">29. OPUS — SAT_QUOTE_HEADER</w:t>
       </w:r>
+      <w:r>
+        <w:t xml:space="preserve">  [M2]</w:t>
+      </w:r>
+      <w:r>
+        <w:t xml:space="preserve">  [M2]</w:t>
+      </w:r>
     </w:p>
     <w:tbl>
       <w:tblPr>
@@ -22247,6 +22421,12 @@
       <w:r>
         <w:t xml:space="preserve">30. OPUS — SAT_RISK_MOTOR_DRIVER</w:t>
       </w:r>
+      <w:r>
+        <w:t xml:space="preserve">  [M2]</w:t>
+      </w:r>
+      <w:r>
+        <w:t xml:space="preserve">  [M2]</w:t>
+      </w:r>
     </w:p>
     <w:tbl>
       <w:tblPr>
@@ -22649,6 +22829,12 @@
       <w:r>
         <w:t xml:space="preserve">31. OPUS — SAT_RISK_MOTOR_VEHICLE</w:t>
       </w:r>
+      <w:r>
+        <w:t xml:space="preserve">  [M2]</w:t>
+      </w:r>
+      <w:r>
+        <w:t xml:space="preserve">  [M2]</w:t>
+      </w:r>
     </w:p>
     <w:tbl>
       <w:tblPr>
@@ -23307,6 +23493,12 @@
       <w:r>
         <w:t xml:space="preserve">32. OPUS — SAT_RISK_OBJECT_CORE</w:t>
       </w:r>
+      <w:r>
+        <w:t xml:space="preserve">  [M3]</w:t>
+      </w:r>
+      <w:r>
+        <w:t xml:space="preserve">  [M3]</w:t>
+      </w:r>
     </w:p>
     <w:tbl>
       <w:tblPr>
@@ -23709,6 +23901,12 @@
       <w:r>
         <w:t xml:space="preserve">33. OPUS — SAT_RISK_PERSON_INSURED</w:t>
       </w:r>
+      <w:r>
+        <w:t xml:space="preserve">  [M3]</w:t>
+      </w:r>
+      <w:r>
+        <w:t xml:space="preserve">  [M3]</w:t>
+      </w:r>
     </w:p>
     <w:tbl>
       <w:tblPr>
@@ -24279,6 +24477,12 @@
       <w:r>
         <w:t xml:space="preserve">34. OPUS — SAT_RISK_PERSON_TRAVEL</w:t>
       </w:r>
+      <w:r>
+        <w:t xml:space="preserve">  [M3]</w:t>
+      </w:r>
+      <w:r>
+        <w:t xml:space="preserve">  [M3]</w:t>
+      </w:r>
     </w:p>
     <w:tbl>
       <w:tblPr>
@@ -25083,6 +25287,12 @@
       <w:r>
         <w:t xml:space="preserve">35. OPUS — SAT_AUG_COMMON_COMMUNICATION_PREFERENCE</w:t>
       </w:r>
+      <w:r>
+        <w:t xml:space="preserve">  [M3]</w:t>
+      </w:r>
+      <w:r>
+        <w:t xml:space="preserve">  [M3]</w:t>
+      </w:r>
     </w:p>
     <w:tbl>
       <w:tblPr>
@@ -25485,6 +25695,12 @@
       <w:r>
         <w:t xml:space="preserve">36. OPUS — SAT_AUG_COVERAGE_DEFINITION</w:t>
       </w:r>
+      <w:r>
+        <w:t xml:space="preserve">  [M3]</w:t>
+      </w:r>
+      <w:r>
+        <w:t xml:space="preserve">  [M3]</w:t>
+      </w:r>
     </w:p>
     <w:tbl>
       <w:tblPr>
@@ -25933,6 +26149,12 @@
       <w:r>
         <w:t xml:space="preserve">37. OPUS — SAT_AUG_COVERAGE_LIMITS</w:t>
       </w:r>
+      <w:r>
+        <w:t xml:space="preserve">  [M3]</w:t>
+      </w:r>
+      <w:r>
+        <w:t xml:space="preserve">  [M3]</w:t>
+      </w:r>
     </w:p>
     <w:tbl>
       <w:tblPr>
@@ -26431,6 +26653,12 @@
       <w:r>
         <w:t xml:space="preserve">38. OPUS — SAT_AUG_COVERAGE_RATING</w:t>
       </w:r>
+      <w:r>
+        <w:t xml:space="preserve">  [M3]</w:t>
+      </w:r>
+      <w:r>
+        <w:t xml:space="preserve">  [M3]</w:t>
+      </w:r>
     </w:p>
     <w:tbl>
       <w:tblPr>
@@ -27105,6 +27333,12 @@
       <w:r>
         <w:t xml:space="preserve">39. OPUS — SAT_AUG_FINTXN_PREMIUM</w:t>
       </w:r>
+      <w:r>
+        <w:t xml:space="preserve">  [M3]</w:t>
+      </w:r>
+      <w:r>
+        <w:t xml:space="preserve">  [M3]</w:t>
+      </w:r>
     </w:p>
     <w:tbl>
       <w:tblPr>
@@ -27797,6 +28031,12 @@
       <w:r>
         <w:t xml:space="preserve">40. OPUS — SAT_AUG_LNK_PARTY_ROLE_CORE</w:t>
       </w:r>
+      <w:r>
+        <w:t xml:space="preserve">  [M3]</w:t>
+      </w:r>
+      <w:r>
+        <w:t xml:space="preserve">  [M3]</w:t>
+      </w:r>
     </w:p>
     <w:tbl>
       <w:tblPr>
@@ -28199,6 +28439,12 @@
       <w:r>
         <w:t xml:space="preserve">41. OPUS — SAT_AUG_LNK_ROLE_CUSTOMER</w:t>
       </w:r>
+      <w:r>
+        <w:t xml:space="preserve">  [M3]</w:t>
+      </w:r>
+      <w:r>
+        <w:t xml:space="preserve">  [M3]</w:t>
+      </w:r>
     </w:p>
     <w:tbl>
       <w:tblPr>
@@ -28723,6 +28969,12 @@
       <w:r>
         <w:t xml:space="preserve">42. OPUS — SAT_AUG_PARTY_BANKING</w:t>
       </w:r>
+      <w:r>
+        <w:t xml:space="preserve">  [M3]</w:t>
+      </w:r>
+      <w:r>
+        <w:t xml:space="preserve">  [M3]</w:t>
+      </w:r>
     </w:p>
     <w:tbl>
       <w:tblPr>
@@ -29125,6 +29377,12 @@
       <w:r>
         <w:t xml:space="preserve">43. OPUS — SAT_AUG_PARTY_EMPLOYMENT</w:t>
       </w:r>
+      <w:r>
+        <w:t xml:space="preserve">  [M3]</w:t>
+      </w:r>
+      <w:r>
+        <w:t xml:space="preserve">  [M3]</w:t>
+      </w:r>
     </w:p>
     <w:tbl>
       <w:tblPr>
@@ -29649,6 +29907,12 @@
       <w:r>
         <w:t xml:space="preserve">44. OPUS — SAT_AUG_PRODUCT_TERMS</w:t>
       </w:r>
+      <w:r>
+        <w:t xml:space="preserve">  [M3]</w:t>
+      </w:r>
+      <w:r>
+        <w:t xml:space="preserve">  [M3]</w:t>
+      </w:r>
     </w:p>
     <w:tbl>
       <w:tblPr>
@@ -30437,6 +30701,12 @@
       <w:r>
         <w:t xml:space="preserve">45. OPUS — SAT_AUG_RISK_PERSON_INSURED</w:t>
       </w:r>
+      <w:r>
+        <w:t xml:space="preserve">  [M3]</w:t>
+      </w:r>
+      <w:r>
+        <w:t xml:space="preserve">  [M3]</w:t>
+      </w:r>
     </w:p>
     <w:tbl>
       <w:tblPr>
@@ -30886,6 +31156,12 @@
       </w:pPr>
       <w:r>
         <w:t xml:space="preserve">46. OPUS — SAT_AUG_RISK_PERSON_TRAVEL</w:t>
+      </w:r>
+      <w:r>
+        <w:t xml:space="preserve">  [M3]</w:t>
+      </w:r>
+      <w:r>
+        <w:t xml:space="preserve">  [M3]</w:t>
       </w:r>
     </w:p>
     <w:tbl>

</xml_diff>